<commit_message>
Contadores do gps_bench separados: checksum mau, sem fix, recusadas, aceites
</commit_message>
<xml_diff>
--- a/docs/SAILSAFE_Architecture_v1_13.docx
+++ b/docs/SAILSAFE_Architecture_v1_13.docx
@@ -257,7 +257,7 @@
           </w:tcPr>
           <w:p>
             <w:r>
-              <w:t>Sense do ADS1015 e leitor de GPS implementados e cobertos por testes, ainda sem hardware. Ligação do GPS fechada (OPEN-005): UART do GPIO em /dev/serial0 a 9600. Ponto de regresso definido (fecha OPEN-006 na parte do ponto; o trajeto é linha reta em plano de água aberto e à vista). Telemetria em tempo real continua futura e passa a estar explicitamente dependente da escolha do rádio (OPEN-011). Firmware gravado no ESP32 e ack da trava de propulsão confirmado por observação em bancada a 6 de agosto.</w:t>
+              <w:t>Sense do ADS1015 e leitor de GPS implementados e cobertos por testes, ainda sem hardware. Ligação do GPS fechada (OPEN-005): UART do GPIO em /dev/serial0 a 9600. Ponto de regresso definido (fecha OPEN-006 na parte do ponto; o trajeto é linha reta em plano de água aberto e à vista). Telemetria em tempo real continua futura e passa a estar explicitamente dependente da escolha do rádio (OPEN-011). Firmware gravado no ESP32 e ack da trava de propulsão confirmado por observação em bancada a 6 de agosto. Barramento I2C configurado e documentado (secção 22.7). Primeira ligação do BNO055 sem leitura válida: defeito fechado a 15 de setembro — o módulo está avariado e vai ser substituído (secções 22.8 e 22.9).</w:t>
             </w:r>
           </w:p>
         </w:tc>
@@ -958,7 +958,7 @@
           </w:tcPr>
           <w:p>
             <w:r>
-              <w:t>Sense do ADS1015 implementado em software (PGA reafirmado a cada conversão, saturação tratada como ausência de medição, canal não instalado a devolver ausência e não zero) e gatilho de regresso implementado como guarda latching que recusa decidir sem calibração. Leitor de GPS NMEA com rejeição por checksum, satélites, HDOP, posição nula e idade do fix. OPEN-005 fechada: GPS na UART do GPIO. OPEN-006 fechada na parte do ponto de regresso, que passa a ser a posição registada no ARM a partir de fixes validados; trajeto em linha reta assumido como limitação desta fase. OPEN-007 mantida em aberto e ligada a OPEN-011. 149 testes em Python e 182 verificações em C++. Divisores de sense a 10k/2k em vez de 5k/1k, com o mesmo rácio de 1/6 e, portanto, sem qualquer alteração às tabelas de conversão; condensador de filtro recomendado passa a 1 µF.</w:t>
+              <w:t>Sense do ADS1015 implementado em software (PGA reafirmado a cada conversão, saturação tratada como ausência de medição, canal não instalado a devolver ausência e não zero) e gatilho de regresso implementado como guarda latching que recusa decidir sem calibração. Leitor de GPS NMEA com rejeição por checksum, satélites, HDOP, posição nula e idade do fix. OPEN-005 fechada: GPS na UART do GPIO. OPEN-006 fechada na parte do ponto de regresso, que passa a ser a posição registada no ARM a partir de fixes validados; trajeto em linha reta assumido como limitação desta fase. OPEN-007 mantida em aberto e ligada a OPEN-011. 149 testes em Python e 182 verificações em C++. Divisores de sense a 10k/2k em vez de 5k/1k, com o mesmo rácio de 1/6 e, portanto, sem qualquer alteração às tabelas de conversão; condensador de filtro recomendado passa a 1 µF. Acrescenta a configuração do barramento I2C no Raspberry Pi (dtparam de ativação e de baudrate, com a razão do clock stretching do BNO055) e o registo do defeito em aberto na primeira ligação dos sensores. Fecha o defeito da primeira ligação do BNO055 (módulo avariado) e acrescenta a nota de aquisição e integração do sensor de substituição, incluindo o link de I2C a fechar na placa da Devantech.</w:t>
             </w:r>
           </w:p>
         </w:tc>
@@ -10500,6 +10500,166 @@
       </w:pPr>
       <w:r>
         <w:t>Novo item de verificação, sem número próprio por ser medição e não decisão: fixar o limiar de regresso a partir do consumo real medido da eletrónica, e o raio de chegada a partir da dispersão medida do GPS.</w:t>
+      </w:r>
+    </w:p>
+    <w:p>
+      <w:pPr>
+        <w:pStyle w:val="Heading2"/>
+      </w:pPr>
+      <w:r>
+        <w:t>22.7 Configuração do barramento I2C no Raspberry Pi</w:t>
+      </w:r>
+    </w:p>
+    <w:p>
+      <w:pPr/>
+      <w:r>
+        <w:t>O barramento que liga o BNO055 e o ADS1015 ao Raspberry Pi exige duas linhas de configuração no firmware, lidas no arranque. Ficam registadas aqui porque não são ajustes de bancada: são condições de funcionamento do sistema, e quem reinstalar o cartão sem elas fica com um barco sem rumo e sem sense, sem que nada dê erro que aponte para a causa.</w:t>
+      </w:r>
+    </w:p>
+    <w:p>
+      <w:pPr>
+        <w:pStyle w:val="CodeBlock"/>
+      </w:pPr>
+      <w:r>
+        <w:t># /boot/firmware/config.txt</w:t>
+        <w:br/>
+        <w:t>dtparam=i2c_arm=on</w:t>
+        <w:br/>
+        <w:t>dtparam=i2c_arm_baudrate=10000</w:t>
+      </w:r>
+    </w:p>
+    <w:p>
+      <w:pPr>
+        <w:pStyle w:val="ListBullet"/>
+      </w:pPr>
+      <w:r>
+        <w:t>dtparam=i2c_arm=on — liga o controlador de I2C do header. Sem esta linha o kernel não cria /dev/i2c-1 e nenhum sensor existe para o sistema. Não é opcional nem é omissão do Raspberry Pi OS: vem desligada de fábrica.</w:t>
+      </w:r>
+    </w:p>
+    <w:p>
+      <w:pPr>
+        <w:pStyle w:val="ListBullet"/>
+      </w:pPr>
+      <w:r>
+        <w:t>dtparam=i2c_arm_baudrate=10000 — baixa o relógio do barramento de 100 kHz para 10 kHz. O BNO055 usa clock stretching, e o controlador I2C do Broadcom tem um defeito conhecido a lidar com isso: em vez de esperar pelo sensor, lê à mesma e devolve dados corrompidos. A 10 kHz cada bit dura tanto que o sensor não precisa de esticar o relógio, e o defeito deixa de ter oportunidade de aparecer. É prevenção, não correção de um sintoma observado.</w:t>
+      </w:r>
+    </w:p>
+    <w:p>
+      <w:pPr/>
+      <w:r>
+        <w:t>O custo é o barramento ficar dez vezes mais lento, e é irrelevante para esta aplicação: o rumo é lido a 5 Hz, uns poucos bytes de cada vez, e uma conversão do ADS1015 são dois bytes. A margem temporal continua a ser de várias ordens de grandeza.</w:t>
+      </w:r>
+    </w:p>
+    <w:p>
+      <w:pPr/>
+      <w:r>
+        <w:t>Verificação, porque ter a linha no ficheiro não é o mesmo que estar ativa — um parâmetro que caia dentro de uma secção condicional do config.txt é ignorado em silêncio:</w:t>
+      </w:r>
+    </w:p>
+    <w:p>
+      <w:pPr>
+        <w:pStyle w:val="CodeBlock"/>
+      </w:pPr>
+      <w:r>
+        <w:t>for f in /proc/device-tree/soc/i2c@*/clock-frequency; do</w:t>
+        <w:br/>
+        <w:t xml:space="preserve">  echo -n "$f: "; od -An -tx1 "$f" | tr -d " \n"; echo</w:t>
+        <w:br/>
+        <w:t>done</w:t>
+        <w:br/>
+        <w:t># i2c@7e804000 deve dar 00002710 (10000)</w:t>
+      </w:r>
+    </w:p>
+    <w:p>
+      <w:pPr/>
+      <w:r>
+        <w:t>Ambos os dispositivos do barramento têm de ter o pino de endereço definido por fio, e não deixado ao ar: ADD a GND no BNO055 (0x28) e ADDR a GND no ADS1015 (0x48). Um pino de endereço a flutuar não dá erro — dá um endereço que muda, e um dispositivo que aparece e desaparece.</w:t>
+      </w:r>
+    </w:p>
+    <w:p>
+      <w:pPr>
+        <w:pStyle w:val="Heading2"/>
+      </w:pPr>
+      <w:r>
+        <w:t>22.8 Primeira ligação dos sensores — defeito do módulo BNO055</w:t>
+      </w:r>
+    </w:p>
+    <w:p>
+      <w:pPr/>
+      <w:r>
+        <w:t>A primeira ligação do BNO055 ao Raspberry Pi (14 de setembro) não produziu uma leitura válida. O sensor é detetado de forma intermitente e alterna entre os seus dois endereços possíveis, 0x28 e 0x29, sem nunca estabilizar. Fica registado aqui o estado da investigação, porque condiciona tudo o que depende de rumo.</w:t>
+      </w:r>
+    </w:p>
+    <w:p>
+      <w:pPr/>
+      <w:r>
+        <w:t>Eliminado com medição: alimentação à entrada do módulo (3,3 V estáveis), continuidade do header aos pads, linhas de SDA e SCL livres em repouso, relógio do barramento (10 kHz confirmados na device tree) e pino de endereço a flutuar (prender ADD a GND não alterou o comportamento). Um ADS1015 posto em paralelo no mesmo barramento também não estabiliza, o que exclui o módulo do BNO055 como causa isolada.</w:t>
+      </w:r>
+    </w:p>
+    <w:p>
+      <w:pPr/>
+      <w:r>
+        <w:t>Resolvido em 15 de setembro: o módulo está avariado. Com o BNO055 fora do barramento, o SDA volta aos 3,3 V e o ADS1015 fica fixo em 0x48, o que prova o barramento, o Raspberry Pi e a cablagem. Alimentando o módulo com 4,7 V medidos no seu próprio pino VIN, o rail interno continua em 2,7 V em vez de 3,3 V, e o SDA continua a drenar cerca de 0,4 mA num pino que devia estar em alta impedância — o equivalente a 6,5 kΩ de fuga para a massa. A hipótese inicial de subalimentação estava errada: o rail baixo era sintoma da avaria e não a sua causa. Um módulo avariado não falha isolado, envenena o barramento inteiro: o ADS1015 aparentava estar em falta apenas por partilhar o mesmo SDA.</w:t>
+      </w:r>
+    </w:p>
+    <w:p>
+      <w:pPr/>
+      <w:r>
+        <w:t>Consequência de projeto, independente do desfecho: enquanto o rumo não for lido de forma estável durante um período contínuo, o modo NAV não tem fonte real de orientação e continua restrito a simulação. Detetar o sensor no barramento não é o critério; ler rumo estável é.</w:t>
+      </w:r>
+    </w:p>
+    <w:p>
+      <w:pPr>
+        <w:pStyle w:val="Heading2"/>
+      </w:pPr>
+      <w:r>
+        <w:t>22.9 Substituição do sensor de rumo — nota de aquisição e integração</w:t>
+      </w:r>
+    </w:p>
+    <w:p>
+      <w:pPr/>
+      <w:r>
+        <w:t>O BNO055 mantém-se como sensor de rumo: o software de leitura, os seus testes e a política de "perante dúvida, não devolver número" estão escritos para ele. A substituição é de placa e não de família. A documentação da Bosch para este sensor avisa para o risco de falsificação nos chips mais sensíveis, o que desaconselha outro módulo genérico sem origem identificável.</w:t>
+      </w:r>
+    </w:p>
+    <w:p>
+      <w:pPr/>
+      <w:r>
+        <w:t>As duas placas consideradas NÃO são equivalentes no momento de ligar, e a diferença é a armadilha que importa registar:</w:t>
+      </w:r>
+    </w:p>
+    <w:p>
+      <w:pPr>
+        <w:pStyle w:val="ListBullet"/>
+      </w:pPr>
+      <w:r>
+        <w:t>Devantech / Robot Electronics (Botnroll, 28,50 €) — traz regulação e tradução de níveis para 3,3–5 V, o que elimina por construção a ambiguidade do pino VIN que custou a sessão de 14 de setembro. Mas vem de fábrica em modo SÉRIE (115 200 8N1), e por isso a sua documentação fala em TX e RX e não em SDA e SCL. Para funcionar em I2C é preciso FECHAR UM LINK NA PRÓPRIA PLACA. Depois disso responde em 0x28, o endereço por omissão do create_bno055(), sem alteração ao código.</w:t>
+      </w:r>
+    </w:p>
+    <w:p>
+      <w:pPr>
+        <w:pStyle w:val="ListBullet"/>
+      </w:pPr>
+      <w:r>
+        <w:t>Adafruit BNO055 (PTRobotics) — vem em I2C de origem, sem link para fechar. Mais cara, sem manobras.</w:t>
+      </w:r>
+    </w:p>
+    <w:p>
+      <w:pPr/>
+      <w:r>
+        <w:t>O BNO055 fala I2C e UART nos mesmos pinos físicos, com o modo escolhido por um pino de configuração; é por isso que os módulos os marcam SCL\RX e SDA\TX. Se o link de I2C ficar por fechar, a placa não aparece no i2cdetect e o sintoma é indistinguível de uma placa morta — exatamente o quadro que levou uma noite a resolver.</w:t>
+      </w:r>
+    </w:p>
+    <w:p>
+      <w:pPr/>
+      <w:r>
+        <w:t>Independente da placa escolhida: o dtparam=i2c_arm_baudrate=10000 da secção 22.7 mantém-se. O defeito de clock stretching está no controlador de I2C do Raspberry Pi e não no sensor, pelo que não desaparece com melhor hardware do outro lado do barramento.</w:t>
+      </w:r>
+    </w:p>
+    <w:p>
+      <w:pPr/>
+      <w:r>
+        <w:t>Sem sobresselente nesta fase. O sensor de rumo não tem redundância, mas o kill-switch remoto continua adiado por orçamento e é obrigatório antes de qualquer ensaio sem corda (secção 2.1): um segundo IMU antes do rádio inverteria a ordem de prioridades que o projeto fixou para si próprio. O módulo avariado fica fisicamente marcado como tal, para não voltar a bordo por engano.</w:t>
       </w:r>
     </w:p>
     <w:sectPr>

</xml_diff>

<commit_message>
GPS validado em hardware: dispersao medida, correcoes ao gps_bench, arquitetura 22.7-22.11 e OPEN-013
</commit_message>
<xml_diff>
--- a/docs/SAILSAFE_Architecture_v1_13.docx
+++ b/docs/SAILSAFE_Architecture_v1_13.docx
@@ -257,7 +257,7 @@
           </w:tcPr>
           <w:p>
             <w:r>
-              <w:t>Sense do ADS1015 e leitor de GPS implementados e cobertos por testes, ainda sem hardware. Ligação do GPS fechada (OPEN-005): UART do GPIO em /dev/serial0 a 9600. Ponto de regresso definido (fecha OPEN-006 na parte do ponto; o trajeto é linha reta em plano de água aberto e à vista). Telemetria em tempo real continua futura e passa a estar explicitamente dependente da escolha do rádio (OPEN-011). Firmware gravado no ESP32 e ack da trava de propulsão confirmado por observação em bancada a 6 de agosto. Barramento I2C configurado e documentado (secção 22.7). Primeira ligação do BNO055 sem leitura válida: defeito fechado a 15 de setembro — o módulo está avariado e vai ser substituído (secções 22.8 e 22.9).</w:t>
+              <w:t>Sense do ADS1015 e leitor de GPS implementados e cobertos por testes, ainda sem hardware. Ligação do GPS fechada (OPEN-005): UART do GPIO em /dev/serial0 a 9600. Ponto de regresso definido (fecha OPEN-006 na parte do ponto; o trajeto é linha reta em plano de água aberto e à vista). Telemetria em tempo real continua futura e passa a estar explicitamente dependente da escolha do rádio (OPEN-011). Firmware gravado no ESP32 e ack da trava de propulsão confirmado por observação em bancada a 6 de agosto. Barramento I2C configurado e documentado (secção 22.7). Primeira ligação do BNO055 sem leitura válida: defeito fechado a 15 de setembro — o módulo está avariado e vai ser substituído (secções 22.8 e 22.9). GPS validado em hardware com dispersão medida (secção 22.10). Nova decisão em aberto: cerca virtual (OPEN-013).</w:t>
             </w:r>
           </w:p>
         </w:tc>
@@ -958,7 +958,7 @@
           </w:tcPr>
           <w:p>
             <w:r>
-              <w:t>Sense do ADS1015 implementado em software (PGA reafirmado a cada conversão, saturação tratada como ausência de medição, canal não instalado a devolver ausência e não zero) e gatilho de regresso implementado como guarda latching que recusa decidir sem calibração. Leitor de GPS NMEA com rejeição por checksum, satélites, HDOP, posição nula e idade do fix. OPEN-005 fechada: GPS na UART do GPIO. OPEN-006 fechada na parte do ponto de regresso, que passa a ser a posição registada no ARM a partir de fixes validados; trajeto em linha reta assumido como limitação desta fase. OPEN-007 mantida em aberto e ligada a OPEN-011. 149 testes em Python e 182 verificações em C++. Divisores de sense a 10k/2k em vez de 5k/1k, com o mesmo rácio de 1/6 e, portanto, sem qualquer alteração às tabelas de conversão; condensador de filtro recomendado passa a 1 µF. Acrescenta a configuração do barramento I2C no Raspberry Pi (dtparam de ativação e de baudrate, com a razão do clock stretching do BNO055) e o registo do defeito em aberto na primeira ligação dos sensores. Fecha o defeito da primeira ligação do BNO055 (módulo avariado) e acrescenta a nota de aquisição e integração do sensor de substituição, incluindo o link de I2C a fechar na placa da Devantech.</w:t>
+              <w:t>Sense do ADS1015 implementado em software (PGA reafirmado a cada conversão, saturação tratada como ausência de medição, canal não instalado a devolver ausência e não zero) e gatilho de regresso implementado como guarda latching que recusa decidir sem calibração. Leitor de GPS NMEA com rejeição por checksum, satélites, HDOP, posição nula e idade do fix. OPEN-005 fechada: GPS na UART do GPIO. OPEN-006 fechada na parte do ponto de regresso, que passa a ser a posição registada no ARM a partir de fixes validados; trajeto em linha reta assumido como limitação desta fase. OPEN-007 mantida em aberto e ligada a OPEN-011. 149 testes em Python e 182 verificações em C++. Divisores de sense a 10k/2k em vez de 5k/1k, com o mesmo rácio de 1/6 e, portanto, sem qualquer alteração às tabelas de conversão; condensador de filtro recomendado passa a 1 µF. Acrescenta a configuração do barramento I2C no Raspberry Pi (dtparam de ativação e de baudrate, com a razão do clock stretching do BNO055) e o registo do defeito em aberto na primeira ligação dos sensores. Fecha o defeito da primeira ligação do BNO055 (módulo avariado) e acrescenta a nota de aquisição e integração do sensor de substituição, incluindo o link de I2C a fechar na placa da Devantech. Acrescenta a primeira medição de dispersão do GPS, marcada como limite superior provisório, e abre OPEN-013 (cerca virtual).</w:t>
             </w:r>
           </w:p>
         </w:tc>
@@ -8961,6 +8961,38 @@
           </w:p>
         </w:tc>
       </w:tr>
+      <w:tr>
+        <w:tc>
+          <w:tcPr>
+            <w:tcW w:type="dxa" w:w="3249"/>
+          </w:tcPr>
+          <w:p>
+            <w:r>
+              <w:t>OPEN-013</w:t>
+            </w:r>
+          </w:p>
+        </w:tc>
+        <w:tc>
+          <w:tcPr>
+            <w:tcW w:type="dxa" w:w="3249"/>
+          </w:tcPr>
+          <w:p>
+            <w:r>
+              <w:t>Cerca virtual (geofence) do plano de água</w:t>
+            </w:r>
+          </w:p>
+        </w:tc>
+        <w:tc>
+          <w:tcPr>
+            <w:tcW w:type="dxa" w:w="3249"/>
+          </w:tcPr>
+          <w:p>
+            <w:r>
+              <w:t>Em aberto — proteção contra encalhe por polígono carregado antes da saída, com semântica de guarda (veta, não conduz) e margem dimensionada pela dispersão medida do GPS. Fase 2, depois do kill-switch remoto (OPEN-011). Ver secção 22.11.</w:t>
+            </w:r>
+          </w:p>
+        </w:tc>
+      </w:tr>
     </w:tbl>
     <w:p/>
     <w:p>
@@ -10660,6 +10692,140 @@
       <w:pPr/>
       <w:r>
         <w:t>Sem sobresselente nesta fase. O sensor de rumo não tem redundância, mas o kill-switch remoto continua adiado por orçamento e é obrigatório antes de qualquer ensaio sem corda (secção 2.1): um segundo IMU antes do rádio inverteria a ordem de prioridades que o projeto fixou para si próprio. O módulo avariado fica fisicamente marcado como tal, para não voltar a bordo por engano.</w:t>
+      </w:r>
+    </w:p>
+    <w:p>
+      <w:pPr>
+        <w:pStyle w:val="Heading2"/>
+      </w:pPr>
+      <w:r>
+        <w:t>22.10 Dispersão do GPS — primeira medição, provisória</w:t>
+      </w:r>
+    </w:p>
+    <w:p>
+      <w:pPr/>
+      <w:r>
+        <w:t>Medição de 15 de setembro, com o receptor parado durante 10 minutos (597 fixes, logs/gps_dispersao.csv): caixa de 31,4 m norte-sul por 4,3 m este-oeste, raio mediano 8,3 m, raio a 95 % 18,7 m, máximo 19,9 m. Cinco a oito satélites, HDOP entre 1,05 e 2,77, com 591 dos 597 fixes abaixo do limiar de 2,5 da política. Das 2 600 tramas recebidas, nenhuma com checksum inválido.</w:t>
+      </w:r>
+    </w:p>
+    <w:p>
+      <w:pPr/>
+      <w:r>
+        <w:t>O resultado não é o valor, é a forma. Trinta e um metros num eixo e quatro no outro não é ruído aleatório — ruído seria isotrópico. É deriva numa direção só, e contrasta com o curto prazo: em onze segundos a posição andou 31 cm em norte-sul e 40 cm em este-oeste. O receptor é preciso ao segundo e arrasta-se ao longo dos minutos, que é o comportamento esperado com metade do céu obstruída: os satélites ficam todos do mesmo lado e o erro alonga-se nessa direção, com multipath do edifício a somar-se.</w:t>
+      </w:r>
+    </w:p>
+    <w:p>
+      <w:pPr/>
+      <w:r>
+        <w:t>Nota de política: os seis fixes com HDOP acima de 2,5 foram corretamente filtrados, e não é aí que está o problema — a deriva acontece com HDOP de 1,05. O critério de HDOP protege contra geometria má, não contra obstrução.</w:t>
+      </w:r>
+    </w:p>
+    <w:p>
+      <w:pPr/>
+      <w:r>
+        <w:t>Estes valores ficam como LIMITE SUPERIOR PROVISÓRIO e não como especificação. A medição foi feita a um parapeito, sem o barco montado e sem a eletrónica a trabalhar junto à antena. Água aberta é o melhor ambiente possível para um receptor GNSS — céu inteiro, sem reflexões de edifícios — pelo que se espera um resultado bastante melhor no local. A medição definitiva faz-se com o barco montado, no plano de água do ensaio, e é dela que saem três números: o raio de chegada dos waypoints, a tolerância do ponto de regresso (secção 22.3) e a margem da cerca virtual (secção 22.11).</w:t>
+      </w:r>
+    </w:p>
+    <w:p>
+      <w:pPr>
+        <w:pStyle w:val="Heading2"/>
+      </w:pPr>
+      <w:r>
+        <w:t>22.11 Cerca virtual (geofence) — OPEN-013</w:t>
+      </w:r>
+    </w:p>
+    <w:p>
+      <w:pPr/>
+      <w:r>
+        <w:t>Registada como decisão em aberto para não se perder. É a proteção contra encalhe que um barco sem sensores de obstáculos pode ter, e assenta apenas em posição — que é o sensor que o projeto já tem a funcionar.</w:t>
+      </w:r>
+    </w:p>
+    <w:p>
+      <w:pPr/>
+      <w:r>
+        <w:t>Princípio: o contorno do plano de água é carregado no Raspberry Pi ANTES de sair, como uma lista de coordenadas num ficheiro. Nunca é obtido em tempo real — na água não há rede, e uma proteção que dependa de rede não é uma proteção. Os polígonos das massas de água existem em dados abertos (OpenStreetMap); para um único plano de água, desenhá-lo à mão sobre um mapa é mais rápido e mais fiável do que extraí-lo automaticamente.</w:t>
+      </w:r>
+    </w:p>
+    <w:p>
+      <w:pPr/>
+      <w:r>
+        <w:t>Semântica, alinhada com as restantes proteções do projeto:</w:t>
+      </w:r>
+    </w:p>
+    <w:p>
+      <w:pPr>
+        <w:pStyle w:val="ListBullet"/>
+      </w:pPr>
+      <w:r>
+        <w:t>É uma GUARDA, não um navegador. Não conduz o barco: veta. Se o passo seguinte sair do polígono, o resultado é parar, não corrigir o rumo.</w:t>
+      </w:r>
+    </w:p>
+    <w:p>
+      <w:pPr>
+        <w:pStyle w:val="ListBullet"/>
+      </w:pPr>
+      <w:r>
+        <w:t>Sem posição não se sabe se se está dentro, logo para-se — a mesma regra do gatilho de regresso e do RealHeading: perante dúvida, não se inventa.</w:t>
+      </w:r>
+    </w:p>
+    <w:p>
+      <w:pPr>
+        <w:pStyle w:val="ListBullet"/>
+      </w:pPr>
+      <w:r>
+        <w:t>A cerca é DESENHADA PARA DENTRO da margem real, por uma margem igual ao erro de posição mais a distância de paragem mais folga. Uma cerca colada à linha de costa com um erro de posição de 15 a 20 m não protege de nada. É a dispersão medida na secção 22.10 que dimensiona esta margem.</w:t>
+      </w:r>
+    </w:p>
+    <w:p>
+      <w:pPr>
+        <w:pStyle w:val="ListBullet"/>
+      </w:pPr>
+      <w:r>
+        <w:t>A verificação é geometria pura — ponto em polígono e distância à aresta — portanto testável sem hardware nenhum, como o resto da lógica de segurança.</w:t>
+      </w:r>
+    </w:p>
+    <w:p>
+      <w:pPr/>
+      <w:r>
+        <w:t>Limitações, que valem tanto como a funcionalidade:</w:t>
+      </w:r>
+    </w:p>
+    <w:p>
+      <w:pPr>
+        <w:pStyle w:val="ListBullet"/>
+      </w:pPr>
+      <w:r>
+        <w:t>Um polígono de margem não conhece a profundidade. É possível estar bem dentro do polígono e encalhar num banco de areia.</w:t>
+      </w:r>
+    </w:p>
+    <w:p>
+      <w:pPr>
+        <w:pStyle w:val="ListBullet"/>
+      </w:pPr>
+      <w:r>
+        <w:t>É um mapa estático: não sabe de embarcações, boias, nadadores ou qualquer coisa que se mova. Não é deteção de obstáculos e não a substitui.</w:t>
+      </w:r>
+    </w:p>
+    <w:p>
+      <w:pPr>
+        <w:pStyle w:val="ListBullet"/>
+      </w:pPr>
+      <w:r>
+        <w:t>Os dados podem estar errados ou desatualizados, e o nível de água varia com a maré ou o caudal.</w:t>
+      </w:r>
+    </w:p>
+    <w:p>
+      <w:pPr>
+        <w:pStyle w:val="ListBullet"/>
+      </w:pPr>
+      <w:r>
+        <w:t>Não substitui o corte remoto nem ter o barco à vista.</w:t>
+      </w:r>
+    </w:p>
+    <w:p>
+      <w:pPr/>
+      <w:r>
+        <w:t>Prioridade: Fase 2, depois do kill-switch remoto. Uma cerca virtual sem corte remoto protegeria contra o risco menor deixando o maior em aberto, o que inverteria a ordem de prioridades que o projeto fixou para si próprio na secção 2.1.</w:t>
       </w:r>
     </w:p>
     <w:sectPr>

</xml_diff>